<commit_message>
Updated user manial of Online_inventory_management_system with how to make the login part
</commit_message>
<xml_diff>
--- a/User Manual.docx
+++ b/User Manual.docx
@@ -138,6 +138,32 @@
           <w:szCs w:val="28"/>
           <w:u w:val="none"/>
         </w:rPr>
+        <w:t xml:space="preserve">SOLUTION:- one a project, make a project, make </w:t>
+      </w:r>
+      <w:proofErr w:type="spellStart"/>
+      <w:r>
+        <w:rPr>
+          <w:sz w:val="28"/>
+          <w:szCs w:val="28"/>
+          <w:u w:val="none"/>
+        </w:rPr>
+        <w:t>Jframe</w:t>
+      </w:r>
+      <w:proofErr w:type="spellEnd"/>
+      <w:r>
+        <w:rPr>
+          <w:sz w:val="28"/>
+          <w:szCs w:val="28"/>
+          <w:u w:val="none"/>
+        </w:rPr>
+        <w:t>, open SWING menus and then put MENU bar where removed first one and then re-named second one(EDIT) with login</w:t>
+      </w:r>
+      <w:r>
+        <w:rPr>
+          <w:sz w:val="28"/>
+          <w:szCs w:val="28"/>
+          <w:u w:val="none"/>
+        </w:rPr>
         <w:br/>
       </w:r>
       <w:r>
@@ -638,6 +664,7 @@
           <w:szCs w:val="28"/>
           <w:u w:val="none"/>
         </w:rPr>
+        <w:lastRenderedPageBreak/>
         <w:t>Ctrl+A</w:t>
       </w:r>
       <w:proofErr w:type="spellEnd"/>
@@ -1117,6 +1144,7 @@
           <w:szCs w:val="28"/>
           <w:u w:val="none"/>
         </w:rPr>
+        <w:lastRenderedPageBreak/>
         <w:drawing>
           <wp:anchor distT="0" distB="0" distL="114300" distR="114300" simplePos="0" relativeHeight="251663360" behindDoc="0" locked="0" layoutInCell="1" allowOverlap="1" wp14:anchorId="7EDD1CBE" wp14:editId="03A4926C">
             <wp:simplePos x="0" y="0"/>
@@ -2411,44 +2439,16 @@
           <w:szCs w:val="28"/>
           <w:u w:val="none"/>
         </w:rPr>
-        <w:t xml:space="preserve"> select that record first and after that click on modify button, after clicking on modify button a new form </w:t>
-      </w:r>
-      <w:proofErr w:type="gramStart"/>
-      <w:r>
-        <w:rPr>
-          <w:sz w:val="28"/>
-          <w:szCs w:val="28"/>
-          <w:u w:val="none"/>
-        </w:rPr>
-        <w:t>open</w:t>
-      </w:r>
-      <w:proofErr w:type="gramEnd"/>
-      <w:r>
-        <w:rPr>
-          <w:sz w:val="28"/>
-          <w:szCs w:val="28"/>
-          <w:u w:val="none"/>
-        </w:rPr>
-        <w:t xml:space="preserve"> as shown in </w:t>
-      </w:r>
-      <w:r>
-        <w:rPr>
-          <w:b/>
-          <w:sz w:val="28"/>
-          <w:szCs w:val="28"/>
-          <w:u w:val="none"/>
-        </w:rPr>
-        <w:t xml:space="preserve">figure </w:t>
-      </w:r>
-      <w:proofErr w:type="gramStart"/>
-      <w:r>
-        <w:rPr>
-          <w:b/>
-          <w:sz w:val="28"/>
-          <w:szCs w:val="28"/>
-          <w:u w:val="none"/>
-        </w:rPr>
-        <w:t>11</w:t>
+        <w:t xml:space="preserve"> select that record first and after that click on modify button, after clicking on modify button a new form open as shown in </w:t>
+      </w:r>
+      <w:r>
+        <w:rPr>
+          <w:b/>
+          <w:sz w:val="28"/>
+          <w:szCs w:val="28"/>
+          <w:u w:val="none"/>
+        </w:rPr>
+        <w:t>figure 11</w:t>
       </w:r>
       <w:r>
         <w:rPr>
@@ -2464,16 +2464,7 @@
           <w:szCs w:val="28"/>
           <w:u w:val="none"/>
         </w:rPr>
-        <w:t>In</w:t>
-      </w:r>
-      <w:proofErr w:type="gramEnd"/>
-      <w:r>
-        <w:rPr>
-          <w:sz w:val="28"/>
-          <w:szCs w:val="28"/>
-          <w:u w:val="none"/>
-        </w:rPr>
-        <w:t xml:space="preserve"> this </w:t>
+        <w:t xml:space="preserve">In this </w:t>
       </w:r>
       <w:r>
         <w:rPr>
@@ -2759,25 +2750,7 @@
           <w:szCs w:val="28"/>
           <w:u w:val="none"/>
         </w:rPr>
-        <w:t xml:space="preserve">it </w:t>
-      </w:r>
-      <w:proofErr w:type="gramStart"/>
-      <w:r>
-        <w:rPr>
-          <w:sz w:val="28"/>
-          <w:szCs w:val="28"/>
-          <w:u w:val="none"/>
-        </w:rPr>
-        <w:t>show</w:t>
-      </w:r>
-      <w:proofErr w:type="gramEnd"/>
-      <w:r>
-        <w:rPr>
-          <w:sz w:val="28"/>
-          <w:szCs w:val="28"/>
-          <w:u w:val="none"/>
-        </w:rPr>
-        <w:t xml:space="preserve"> the Status of Inventory. </w:t>
+        <w:t xml:space="preserve">it show the Status of Inventory. </w:t>
       </w:r>
       <w:r>
         <w:rPr>
@@ -3036,25 +3009,7 @@
           <w:szCs w:val="28"/>
           <w:u w:val="none"/>
         </w:rPr>
-        <w:t xml:space="preserve"> a new form </w:t>
-      </w:r>
-      <w:proofErr w:type="gramStart"/>
-      <w:r>
-        <w:rPr>
-          <w:sz w:val="28"/>
-          <w:szCs w:val="28"/>
-          <w:u w:val="none"/>
-        </w:rPr>
-        <w:t>open</w:t>
-      </w:r>
-      <w:proofErr w:type="gramEnd"/>
-      <w:r>
-        <w:rPr>
-          <w:sz w:val="28"/>
-          <w:szCs w:val="28"/>
-          <w:u w:val="none"/>
-        </w:rPr>
-        <w:t xml:space="preserve"> as shown in </w:t>
+        <w:t xml:space="preserve"> a new form open as shown in </w:t>
       </w:r>
       <w:r>
         <w:rPr>
@@ -3103,44 +3058,26 @@
           <w:szCs w:val="28"/>
           <w:u w:val="none"/>
         </w:rPr>
+        <w:t xml:space="preserve"> click on </w:t>
+      </w:r>
+      <w:r>
+        <w:rPr>
+          <w:b/>
+          <w:sz w:val="28"/>
+          <w:szCs w:val="28"/>
+          <w:u w:val="none"/>
+        </w:rPr>
+        <w:t>Add Button</w:t>
+      </w:r>
+      <w:r>
+        <w:rPr>
+          <w:b/>
+          <w:sz w:val="28"/>
+          <w:szCs w:val="28"/>
+          <w:u w:val="none"/>
+        </w:rPr>
         <w:t xml:space="preserve"> </w:t>
       </w:r>
-      <w:proofErr w:type="gramStart"/>
-      <w:r>
-        <w:rPr>
-          <w:sz w:val="28"/>
-          <w:szCs w:val="28"/>
-          <w:u w:val="none"/>
-        </w:rPr>
-        <w:t>click</w:t>
-      </w:r>
-      <w:proofErr w:type="gramEnd"/>
-      <w:r>
-        <w:rPr>
-          <w:sz w:val="28"/>
-          <w:szCs w:val="28"/>
-          <w:u w:val="none"/>
-        </w:rPr>
-        <w:t xml:space="preserve"> on </w:t>
-      </w:r>
-      <w:r>
-        <w:rPr>
-          <w:b/>
-          <w:sz w:val="28"/>
-          <w:szCs w:val="28"/>
-          <w:u w:val="none"/>
-        </w:rPr>
-        <w:t>Add Button</w:t>
-      </w:r>
-      <w:r>
-        <w:rPr>
-          <w:b/>
-          <w:sz w:val="28"/>
-          <w:szCs w:val="28"/>
-          <w:u w:val="none"/>
-        </w:rPr>
-        <w:t xml:space="preserve"> </w:t>
-      </w:r>
       <w:r>
         <w:rPr>
           <w:sz w:val="28"/>
@@ -3155,25 +3092,7 @@
           <w:szCs w:val="28"/>
           <w:u w:val="none"/>
         </w:rPr>
-        <w:t xml:space="preserve"> record add on </w:t>
-      </w:r>
-      <w:proofErr w:type="gramStart"/>
-      <w:r>
-        <w:rPr>
-          <w:sz w:val="28"/>
-          <w:szCs w:val="28"/>
-          <w:u w:val="none"/>
-        </w:rPr>
-        <w:t>form  Table</w:t>
-      </w:r>
-      <w:proofErr w:type="gramEnd"/>
-      <w:r>
-        <w:rPr>
-          <w:sz w:val="28"/>
-          <w:szCs w:val="28"/>
-          <w:u w:val="none"/>
-        </w:rPr>
-        <w:t xml:space="preserve"> and al</w:t>
+        <w:t xml:space="preserve"> record add on form  Table and al</w:t>
       </w:r>
       <w:r>
         <w:rPr>
@@ -3246,25 +3165,7 @@
           <w:szCs w:val="28"/>
           <w:u w:val="none"/>
         </w:rPr>
-        <w:t xml:space="preserve"> </w:t>
-      </w:r>
-      <w:proofErr w:type="gramStart"/>
-      <w:r>
-        <w:rPr>
-          <w:sz w:val="28"/>
-          <w:szCs w:val="28"/>
-          <w:u w:val="none"/>
-        </w:rPr>
-        <w:t>click</w:t>
-      </w:r>
-      <w:proofErr w:type="gramEnd"/>
-      <w:r>
-        <w:rPr>
-          <w:sz w:val="28"/>
-          <w:szCs w:val="28"/>
-          <w:u w:val="none"/>
-        </w:rPr>
-        <w:t xml:space="preserve"> on </w:t>
+        <w:t xml:space="preserve"> click on </w:t>
       </w:r>
       <w:r>
         <w:rPr>
@@ -3895,6 +3796,7 @@
           <w:sz w:val="28"/>
           <w:szCs w:val="28"/>
         </w:rPr>
+        <w:lastRenderedPageBreak/>
         <w:t>Figure 15</w:t>
       </w:r>
     </w:p>
@@ -3912,7 +3814,6 @@
           <w:szCs w:val="28"/>
           <w:u w:val="none"/>
         </w:rPr>
-        <w:lastRenderedPageBreak/>
         <w:t xml:space="preserve">After that </w:t>
       </w:r>
       <w:r>
@@ -4564,6 +4465,7 @@
           <w:szCs w:val="28"/>
           <w:u w:val="none"/>
         </w:rPr>
+        <w:lastRenderedPageBreak/>
         <w:drawing>
           <wp:anchor distT="0" distB="0" distL="114300" distR="114300" simplePos="0" relativeHeight="251673600" behindDoc="0" locked="0" layoutInCell="1" allowOverlap="1" wp14:anchorId="5F401298" wp14:editId="38162CDB">
             <wp:simplePos x="0" y="0"/>
@@ -4724,7 +4626,6 @@
           <w:szCs w:val="28"/>
           <w:u w:val="none"/>
         </w:rPr>
-        <w:lastRenderedPageBreak/>
         <w:t xml:space="preserve">After that when </w:t>
       </w:r>
       <w:r>
@@ -5118,6 +5019,7 @@
           <w:sz w:val="28"/>
           <w:szCs w:val="28"/>
         </w:rPr>
+        <w:lastRenderedPageBreak/>
         <w:t xml:space="preserve">Now </w:t>
       </w:r>
       <w:r>
@@ -5485,7 +5387,6 @@
           <w:szCs w:val="28"/>
           <w:u w:val="none"/>
         </w:rPr>
-        <w:lastRenderedPageBreak/>
         <w:drawing>
           <wp:anchor distT="0" distB="0" distL="114300" distR="114300" simplePos="0" relativeHeight="251676672" behindDoc="0" locked="0" layoutInCell="1" allowOverlap="1" wp14:anchorId="6E491BA5" wp14:editId="05B6706C">
             <wp:simplePos x="0" y="0"/>
@@ -5696,17 +5597,7 @@
           <w:szCs w:val="28"/>
           <w:u w:val="none"/>
         </w:rPr>
-        <w:t xml:space="preserve">s </w:t>
-      </w:r>
-      <w:proofErr w:type="gramStart"/>
-      <w:r>
-        <w:rPr>
-          <w:b/>
-          <w:sz w:val="28"/>
-          <w:szCs w:val="28"/>
-          <w:u w:val="none"/>
-        </w:rPr>
-        <w:t>Button</w:t>
+        <w:t>s Button</w:t>
       </w:r>
       <w:r>
         <w:rPr>
@@ -5731,7 +5622,6 @@
         </w:rPr>
         <w:t>so</w:t>
       </w:r>
-      <w:proofErr w:type="gramEnd"/>
       <w:r>
         <w:rPr>
           <w:sz w:val="28"/>
@@ -5824,6 +5714,7 @@
           <w:szCs w:val="28"/>
           <w:u w:val="none"/>
         </w:rPr>
+        <w:lastRenderedPageBreak/>
         <w:drawing>
           <wp:inline distT="0" distB="0" distL="0" distR="0" wp14:anchorId="43038CDE" wp14:editId="7A3FEBE0">
             <wp:extent cx="5772150" cy="3838575"/>
@@ -7287,17 +7178,7 @@
           <w:szCs w:val="28"/>
           <w:u w:val="none"/>
         </w:rPr>
-        <w:t xml:space="preserve"> figure </w:t>
-      </w:r>
-      <w:proofErr w:type="gramStart"/>
-      <w:r>
-        <w:rPr>
-          <w:b/>
-          <w:sz w:val="28"/>
-          <w:szCs w:val="28"/>
-          <w:u w:val="none"/>
-        </w:rPr>
-        <w:t>2</w:t>
+        <w:t xml:space="preserve"> figure 2</w:t>
       </w:r>
       <w:r>
         <w:rPr>
@@ -7314,16 +7195,7 @@
           <w:szCs w:val="28"/>
           <w:u w:val="none"/>
         </w:rPr>
-        <w:t>These</w:t>
-      </w:r>
-      <w:proofErr w:type="gramEnd"/>
-      <w:r>
-        <w:rPr>
-          <w:sz w:val="28"/>
-          <w:szCs w:val="28"/>
-          <w:u w:val="none"/>
-        </w:rPr>
-        <w:t xml:space="preserve"> all Transactions shown as </w:t>
+        <w:t xml:space="preserve">These all Transactions shown as </w:t>
       </w:r>
       <w:r>
         <w:rPr>

</xml_diff>

<commit_message>
Updated user manual of Online_inventory_management_system with how to make dropdown in login part
</commit_message>
<xml_diff>
--- a/User Manual.docx
+++ b/User Manual.docx
@@ -132,13 +132,23 @@
           <w:u w:val="none"/>
         </w:rPr>
       </w:pPr>
-      <w:r>
-        <w:rPr>
-          <w:sz w:val="28"/>
-          <w:szCs w:val="28"/>
-          <w:u w:val="none"/>
-        </w:rPr>
-        <w:t xml:space="preserve">SOLUTION:- one a project, make a project, make </w:t>
+      <w:proofErr w:type="gramStart"/>
+      <w:r>
+        <w:rPr>
+          <w:sz w:val="28"/>
+          <w:szCs w:val="28"/>
+          <w:u w:val="none"/>
+        </w:rPr>
+        <w:t>SOLUTION:-</w:t>
+      </w:r>
+      <w:proofErr w:type="gramEnd"/>
+      <w:r>
+        <w:rPr>
+          <w:sz w:val="28"/>
+          <w:szCs w:val="28"/>
+          <w:u w:val="none"/>
+        </w:rPr>
+        <w:t xml:space="preserve"> one a project, make a project, make </w:t>
       </w:r>
       <w:proofErr w:type="spellStart"/>
       <w:r>
@@ -156,7 +166,43 @@
           <w:szCs w:val="28"/>
           <w:u w:val="none"/>
         </w:rPr>
-        <w:t>, open SWING menus and then put MENU bar where removed first one and then re-named second one(EDIT) with login</w:t>
+        <w:t xml:space="preserve">, open SWING menus and then put MENU bar </w:t>
+      </w:r>
+      <w:proofErr w:type="gramStart"/>
+      <w:r>
+        <w:rPr>
+          <w:sz w:val="28"/>
+          <w:szCs w:val="28"/>
+          <w:u w:val="none"/>
+        </w:rPr>
+        <w:t>where</w:t>
+      </w:r>
+      <w:proofErr w:type="gramEnd"/>
+      <w:r>
+        <w:rPr>
+          <w:sz w:val="28"/>
+          <w:szCs w:val="28"/>
+          <w:u w:val="none"/>
+        </w:rPr>
+        <w:t xml:space="preserve"> removed first one and then re-named second </w:t>
+      </w:r>
+      <w:proofErr w:type="gramStart"/>
+      <w:r>
+        <w:rPr>
+          <w:sz w:val="28"/>
+          <w:szCs w:val="28"/>
+          <w:u w:val="none"/>
+        </w:rPr>
+        <w:t>one(</w:t>
+      </w:r>
+      <w:proofErr w:type="gramEnd"/>
+      <w:r>
+        <w:rPr>
+          <w:sz w:val="28"/>
+          <w:szCs w:val="28"/>
+          <w:u w:val="none"/>
+        </w:rPr>
+        <w:t>EDIT) with login</w:t>
       </w:r>
       <w:r>
         <w:rPr>
@@ -348,6 +394,144 @@
     <w:p>
       <w:pPr>
         <w:rPr>
+          <w:b/>
+          <w:sz w:val="28"/>
+          <w:szCs w:val="28"/>
+          <w:u w:val="none"/>
+        </w:rPr>
+      </w:pPr>
+      <w:r>
+        <w:rPr>
+          <w:b/>
+          <w:sz w:val="28"/>
+          <w:szCs w:val="28"/>
+        </w:rPr>
+        <w:lastRenderedPageBreak/>
+        <w:drawing>
+          <wp:inline distT="0" distB="0" distL="0" distR="0" wp14:anchorId="6D8BE56F" wp14:editId="7788297F">
+            <wp:extent cx="2072640" cy="2312175"/>
+            <wp:effectExtent l="0" t="0" r="3810" b="0"/>
+            <wp:docPr id="16551343" name="Picture 1"/>
+            <wp:cNvGraphicFramePr>
+              <a:graphicFrameLocks xmlns:a="http://schemas.openxmlformats.org/drawingml/2006/main" noChangeAspect="1"/>
+            </wp:cNvGraphicFramePr>
+            <a:graphic xmlns:a="http://schemas.openxmlformats.org/drawingml/2006/main">
+              <a:graphicData uri="http://schemas.openxmlformats.org/drawingml/2006/picture">
+                <pic:pic xmlns:pic="http://schemas.openxmlformats.org/drawingml/2006/picture">
+                  <pic:nvPicPr>
+                    <pic:cNvPr id="16551343" name=""/>
+                    <pic:cNvPicPr/>
+                  </pic:nvPicPr>
+                  <pic:blipFill>
+                    <a:blip r:embed="rId6"/>
+                    <a:stretch>
+                      <a:fillRect/>
+                    </a:stretch>
+                  </pic:blipFill>
+                  <pic:spPr>
+                    <a:xfrm>
+                      <a:off x="0" y="0"/>
+                      <a:ext cx="2078159" cy="2318331"/>
+                    </a:xfrm>
+                    <a:prstGeom prst="rect">
+                      <a:avLst/>
+                    </a:prstGeom>
+                  </pic:spPr>
+                </pic:pic>
+              </a:graphicData>
+            </a:graphic>
+          </wp:inline>
+        </w:drawing>
+      </w:r>
+      <w:r>
+        <w:rPr>
+          <w:b/>
+          <w:sz w:val="28"/>
+          <w:szCs w:val="28"/>
+        </w:rPr>
+        <w:t xml:space="preserve"> </w:t>
+      </w:r>
+      <w:proofErr w:type="spellStart"/>
+      <w:r>
+        <w:rPr>
+          <w:b/>
+          <w:sz w:val="28"/>
+          <w:szCs w:val="28"/>
+          <w:u w:val="none"/>
+        </w:rPr>
+        <w:t>jmenu</w:t>
+      </w:r>
+      <w:proofErr w:type="spellEnd"/>
+      <w:r>
+        <w:rPr>
+          <w:b/>
+          <w:sz w:val="28"/>
+          <w:szCs w:val="28"/>
+          <w:u w:val="none"/>
+        </w:rPr>
+        <w:t xml:space="preserve">, add from </w:t>
+      </w:r>
+      <w:proofErr w:type="spellStart"/>
+      <w:r>
+        <w:rPr>
+          <w:b/>
+          <w:sz w:val="28"/>
+          <w:szCs w:val="28"/>
+          <w:u w:val="none"/>
+        </w:rPr>
+        <w:t>pallete</w:t>
+      </w:r>
+      <w:proofErr w:type="spellEnd"/>
+      <w:r>
+        <w:rPr>
+          <w:b/>
+          <w:sz w:val="28"/>
+          <w:szCs w:val="28"/>
+          <w:u w:val="none"/>
+        </w:rPr>
+        <w:t xml:space="preserve">, menu </w:t>
+      </w:r>
+      <w:r>
+        <w:rPr>
+          <w:b/>
+          <w:sz w:val="28"/>
+          <w:szCs w:val="28"/>
+          <w:u w:val="none"/>
+        </w:rPr>
+        <w:t xml:space="preserve">Item </w:t>
+      </w:r>
+      <w:r>
+        <w:rPr>
+          <w:b/>
+          <w:sz w:val="28"/>
+          <w:szCs w:val="28"/>
+          <w:u w:val="none"/>
+        </w:rPr>
+        <w:t>for adding the dropdown and then double click and it changes the shortcut key and text</w:t>
+      </w:r>
+    </w:p>
+    <w:p>
+      <w:pPr>
+        <w:rPr>
+          <w:b/>
+          <w:sz w:val="28"/>
+          <w:szCs w:val="28"/>
+          <w:u w:val="none"/>
+        </w:rPr>
+      </w:pPr>
+    </w:p>
+    <w:p>
+      <w:pPr>
+        <w:rPr>
+          <w:b/>
+          <w:sz w:val="28"/>
+          <w:szCs w:val="28"/>
+        </w:rPr>
+      </w:pPr>
+    </w:p>
+    <w:p>
+      <w:pPr>
+        <w:rPr>
           <w:sz w:val="28"/>
           <w:szCs w:val="28"/>
           <w:u w:val="none"/>
@@ -664,7 +848,6 @@
           <w:szCs w:val="28"/>
           <w:u w:val="none"/>
         </w:rPr>
-        <w:lastRenderedPageBreak/>
         <w:t>Ctrl+A</w:t>
       </w:r>
       <w:proofErr w:type="spellEnd"/>
@@ -873,7 +1056,7 @@
                     </pic:cNvPicPr>
                   </pic:nvPicPr>
                   <pic:blipFill>
-                    <a:blip r:embed="rId6"/>
+                    <a:blip r:embed="rId7"/>
                     <a:srcRect/>
                     <a:stretch>
                       <a:fillRect/>
@@ -994,6 +1177,7 @@
           <w:szCs w:val="28"/>
           <w:u w:val="none"/>
         </w:rPr>
+        <w:lastRenderedPageBreak/>
         <w:drawing>
           <wp:anchor distT="0" distB="0" distL="114300" distR="114300" simplePos="0" relativeHeight="251662336" behindDoc="0" locked="0" layoutInCell="1" allowOverlap="1" wp14:anchorId="76D49720" wp14:editId="54B6AB79">
             <wp:simplePos x="0" y="0"/>
@@ -1020,7 +1204,7 @@
                     </pic:cNvPicPr>
                   </pic:nvPicPr>
                   <pic:blipFill>
-                    <a:blip r:embed="rId7"/>
+                    <a:blip r:embed="rId8"/>
                     <a:srcRect/>
                     <a:stretch>
                       <a:fillRect/>
@@ -1144,7 +1328,6 @@
           <w:szCs w:val="28"/>
           <w:u w:val="none"/>
         </w:rPr>
-        <w:lastRenderedPageBreak/>
         <w:drawing>
           <wp:anchor distT="0" distB="0" distL="114300" distR="114300" simplePos="0" relativeHeight="251663360" behindDoc="0" locked="0" layoutInCell="1" allowOverlap="1" wp14:anchorId="7EDD1CBE" wp14:editId="03A4926C">
             <wp:simplePos x="0" y="0"/>
@@ -1171,7 +1354,7 @@
                     </pic:cNvPicPr>
                   </pic:nvPicPr>
                   <pic:blipFill>
-                    <a:blip r:embed="rId8"/>
+                    <a:blip r:embed="rId9"/>
                     <a:srcRect/>
                     <a:stretch>
                       <a:fillRect/>
@@ -1314,7 +1497,7 @@
                     </pic:cNvPicPr>
                   </pic:nvPicPr>
                   <pic:blipFill>
-                    <a:blip r:embed="rId9"/>
+                    <a:blip r:embed="rId10"/>
                     <a:srcRect/>
                     <a:stretch>
                       <a:fillRect/>
@@ -1665,7 +1848,7 @@
                     </pic:cNvPicPr>
                   </pic:nvPicPr>
                   <pic:blipFill>
-                    <a:blip r:embed="rId10"/>
+                    <a:blip r:embed="rId11"/>
                     <a:srcRect/>
                     <a:stretch>
                       <a:fillRect/>
@@ -1799,7 +1982,7 @@
                     </pic:cNvPicPr>
                   </pic:nvPicPr>
                   <pic:blipFill>
-                    <a:blip r:embed="rId11"/>
+                    <a:blip r:embed="rId12"/>
                     <a:srcRect/>
                     <a:stretch>
                       <a:fillRect/>
@@ -2037,7 +2220,7 @@
                     </pic:cNvPicPr>
                   </pic:nvPicPr>
                   <pic:blipFill>
-                    <a:blip r:embed="rId12"/>
+                    <a:blip r:embed="rId13"/>
                     <a:srcRect/>
                     <a:stretch>
                       <a:fillRect/>
@@ -2336,7 +2519,7 @@
                     </pic:cNvPicPr>
                   </pic:nvPicPr>
                   <pic:blipFill>
-                    <a:blip r:embed="rId13"/>
+                    <a:blip r:embed="rId14"/>
                     <a:srcRect/>
                     <a:stretch>
                       <a:fillRect/>
@@ -2439,16 +2622,44 @@
           <w:szCs w:val="28"/>
           <w:u w:val="none"/>
         </w:rPr>
-        <w:t xml:space="preserve"> select that record first and after that click on modify button, after clicking on modify button a new form open as shown in </w:t>
-      </w:r>
-      <w:r>
-        <w:rPr>
-          <w:b/>
-          <w:sz w:val="28"/>
-          <w:szCs w:val="28"/>
-          <w:u w:val="none"/>
-        </w:rPr>
-        <w:t>figure 11</w:t>
+        <w:t xml:space="preserve"> select that record first and after that click on modify button, after clicking on modify button a new form </w:t>
+      </w:r>
+      <w:proofErr w:type="gramStart"/>
+      <w:r>
+        <w:rPr>
+          <w:sz w:val="28"/>
+          <w:szCs w:val="28"/>
+          <w:u w:val="none"/>
+        </w:rPr>
+        <w:t>open</w:t>
+      </w:r>
+      <w:proofErr w:type="gramEnd"/>
+      <w:r>
+        <w:rPr>
+          <w:sz w:val="28"/>
+          <w:szCs w:val="28"/>
+          <w:u w:val="none"/>
+        </w:rPr>
+        <w:t xml:space="preserve"> as shown in </w:t>
+      </w:r>
+      <w:r>
+        <w:rPr>
+          <w:b/>
+          <w:sz w:val="28"/>
+          <w:szCs w:val="28"/>
+          <w:u w:val="none"/>
+        </w:rPr>
+        <w:t xml:space="preserve">figure </w:t>
+      </w:r>
+      <w:proofErr w:type="gramStart"/>
+      <w:r>
+        <w:rPr>
+          <w:b/>
+          <w:sz w:val="28"/>
+          <w:szCs w:val="28"/>
+          <w:u w:val="none"/>
+        </w:rPr>
+        <w:t>11</w:t>
       </w:r>
       <w:r>
         <w:rPr>
@@ -2464,7 +2675,16 @@
           <w:szCs w:val="28"/>
           <w:u w:val="none"/>
         </w:rPr>
-        <w:t xml:space="preserve">In this </w:t>
+        <w:t>In</w:t>
+      </w:r>
+      <w:proofErr w:type="gramEnd"/>
+      <w:r>
+        <w:rPr>
+          <w:sz w:val="28"/>
+          <w:szCs w:val="28"/>
+          <w:u w:val="none"/>
+        </w:rPr>
+        <w:t xml:space="preserve"> this </w:t>
       </w:r>
       <w:r>
         <w:rPr>
@@ -2542,7 +2762,7 @@
                     </pic:cNvPicPr>
                   </pic:nvPicPr>
                   <pic:blipFill>
-                    <a:blip r:embed="rId14"/>
+                    <a:blip r:embed="rId15"/>
                     <a:srcRect/>
                     <a:stretch>
                       <a:fillRect/>
@@ -2750,7 +2970,25 @@
           <w:szCs w:val="28"/>
           <w:u w:val="none"/>
         </w:rPr>
-        <w:t xml:space="preserve">it show the Status of Inventory. </w:t>
+        <w:t xml:space="preserve">it </w:t>
+      </w:r>
+      <w:proofErr w:type="gramStart"/>
+      <w:r>
+        <w:rPr>
+          <w:sz w:val="28"/>
+          <w:szCs w:val="28"/>
+          <w:u w:val="none"/>
+        </w:rPr>
+        <w:t>show</w:t>
+      </w:r>
+      <w:proofErr w:type="gramEnd"/>
+      <w:r>
+        <w:rPr>
+          <w:sz w:val="28"/>
+          <w:szCs w:val="28"/>
+          <w:u w:val="none"/>
+        </w:rPr>
+        <w:t xml:space="preserve"> the Status of Inventory. </w:t>
       </w:r>
       <w:r>
         <w:rPr>
@@ -2843,7 +3081,7 @@
                     </pic:cNvPicPr>
                   </pic:nvPicPr>
                   <pic:blipFill>
-                    <a:blip r:embed="rId15"/>
+                    <a:blip r:embed="rId16"/>
                     <a:srcRect/>
                     <a:stretch>
                       <a:fillRect/>
@@ -3009,7 +3247,25 @@
           <w:szCs w:val="28"/>
           <w:u w:val="none"/>
         </w:rPr>
-        <w:t xml:space="preserve"> a new form open as shown in </w:t>
+        <w:t xml:space="preserve"> a new form </w:t>
+      </w:r>
+      <w:proofErr w:type="gramStart"/>
+      <w:r>
+        <w:rPr>
+          <w:sz w:val="28"/>
+          <w:szCs w:val="28"/>
+          <w:u w:val="none"/>
+        </w:rPr>
+        <w:t>open</w:t>
+      </w:r>
+      <w:proofErr w:type="gramEnd"/>
+      <w:r>
+        <w:rPr>
+          <w:sz w:val="28"/>
+          <w:szCs w:val="28"/>
+          <w:u w:val="none"/>
+        </w:rPr>
+        <w:t xml:space="preserve"> as shown in </w:t>
       </w:r>
       <w:r>
         <w:rPr>
@@ -3058,7 +3314,25 @@
           <w:szCs w:val="28"/>
           <w:u w:val="none"/>
         </w:rPr>
-        <w:t xml:space="preserve"> click on </w:t>
+        <w:t xml:space="preserve"> </w:t>
+      </w:r>
+      <w:proofErr w:type="gramStart"/>
+      <w:r>
+        <w:rPr>
+          <w:sz w:val="28"/>
+          <w:szCs w:val="28"/>
+          <w:u w:val="none"/>
+        </w:rPr>
+        <w:t>click</w:t>
+      </w:r>
+      <w:proofErr w:type="gramEnd"/>
+      <w:r>
+        <w:rPr>
+          <w:sz w:val="28"/>
+          <w:szCs w:val="28"/>
+          <w:u w:val="none"/>
+        </w:rPr>
+        <w:t xml:space="preserve"> on </w:t>
       </w:r>
       <w:r>
         <w:rPr>
@@ -3092,7 +3366,25 @@
           <w:szCs w:val="28"/>
           <w:u w:val="none"/>
         </w:rPr>
-        <w:t xml:space="preserve"> record add on form  Table and al</w:t>
+        <w:t xml:space="preserve"> record add on </w:t>
+      </w:r>
+      <w:proofErr w:type="gramStart"/>
+      <w:r>
+        <w:rPr>
+          <w:sz w:val="28"/>
+          <w:szCs w:val="28"/>
+          <w:u w:val="none"/>
+        </w:rPr>
+        <w:t>form  Table</w:t>
+      </w:r>
+      <w:proofErr w:type="gramEnd"/>
+      <w:r>
+        <w:rPr>
+          <w:sz w:val="28"/>
+          <w:szCs w:val="28"/>
+          <w:u w:val="none"/>
+        </w:rPr>
+        <w:t xml:space="preserve"> and al</w:t>
       </w:r>
       <w:r>
         <w:rPr>
@@ -3165,7 +3457,25 @@
           <w:szCs w:val="28"/>
           <w:u w:val="none"/>
         </w:rPr>
-        <w:t xml:space="preserve"> click on </w:t>
+        <w:t xml:space="preserve"> </w:t>
+      </w:r>
+      <w:proofErr w:type="gramStart"/>
+      <w:r>
+        <w:rPr>
+          <w:sz w:val="28"/>
+          <w:szCs w:val="28"/>
+          <w:u w:val="none"/>
+        </w:rPr>
+        <w:t>click</w:t>
+      </w:r>
+      <w:proofErr w:type="gramEnd"/>
+      <w:r>
+        <w:rPr>
+          <w:sz w:val="28"/>
+          <w:szCs w:val="28"/>
+          <w:u w:val="none"/>
+        </w:rPr>
+        <w:t xml:space="preserve"> on </w:t>
       </w:r>
       <w:r>
         <w:rPr>
@@ -3342,7 +3652,7 @@
                     </pic:cNvPicPr>
                   </pic:nvPicPr>
                   <pic:blipFill>
-                    <a:blip r:embed="rId16"/>
+                    <a:blip r:embed="rId17"/>
                     <a:srcRect/>
                     <a:stretch>
                       <a:fillRect/>
@@ -3459,7 +3769,7 @@
                     </pic:cNvPicPr>
                   </pic:nvPicPr>
                   <pic:blipFill>
-                    <a:blip r:embed="rId17"/>
+                    <a:blip r:embed="rId18"/>
                     <a:srcRect/>
                     <a:stretch>
                       <a:fillRect/>
@@ -3720,7 +4030,7 @@
                     </pic:cNvPicPr>
                   </pic:nvPicPr>
                   <pic:blipFill>
-                    <a:blip r:embed="rId18"/>
+                    <a:blip r:embed="rId19"/>
                     <a:srcRect/>
                     <a:stretch>
                       <a:fillRect/>
@@ -4098,7 +4408,7 @@
                     </pic:cNvPicPr>
                   </pic:nvPicPr>
                   <pic:blipFill>
-                    <a:blip r:embed="rId19"/>
+                    <a:blip r:embed="rId20"/>
                     <a:srcRect b="3813"/>
                     <a:stretch>
                       <a:fillRect/>
@@ -4186,7 +4496,7 @@
                     </pic:cNvPicPr>
                   </pic:nvPicPr>
                   <pic:blipFill>
-                    <a:blip r:embed="rId20"/>
+                    <a:blip r:embed="rId21"/>
                     <a:srcRect/>
                     <a:stretch>
                       <a:fillRect/>
@@ -4492,7 +4802,7 @@
                     </pic:cNvPicPr>
                   </pic:nvPicPr>
                   <pic:blipFill>
-                    <a:blip r:embed="rId21"/>
+                    <a:blip r:embed="rId22"/>
                     <a:srcRect/>
                     <a:stretch>
                       <a:fillRect/>
@@ -4720,7 +5030,7 @@
                     </pic:cNvPicPr>
                   </pic:nvPicPr>
                   <pic:blipFill>
-                    <a:blip r:embed="rId22"/>
+                    <a:blip r:embed="rId23"/>
                     <a:srcRect/>
                     <a:stretch>
                       <a:fillRect/>
@@ -5280,7 +5590,7 @@
                     </pic:cNvPicPr>
                   </pic:nvPicPr>
                   <pic:blipFill>
-                    <a:blip r:embed="rId23"/>
+                    <a:blip r:embed="rId24"/>
                     <a:srcRect/>
                     <a:stretch>
                       <a:fillRect/>
@@ -5413,7 +5723,7 @@
                     </pic:cNvPicPr>
                   </pic:nvPicPr>
                   <pic:blipFill>
-                    <a:blip r:embed="rId24"/>
+                    <a:blip r:embed="rId25"/>
                     <a:srcRect/>
                     <a:stretch>
                       <a:fillRect/>
@@ -5597,7 +5907,17 @@
           <w:szCs w:val="28"/>
           <w:u w:val="none"/>
         </w:rPr>
-        <w:t>s Button</w:t>
+        <w:t xml:space="preserve">s </w:t>
+      </w:r>
+      <w:proofErr w:type="gramStart"/>
+      <w:r>
+        <w:rPr>
+          <w:b/>
+          <w:sz w:val="28"/>
+          <w:szCs w:val="28"/>
+          <w:u w:val="none"/>
+        </w:rPr>
+        <w:t>Button</w:t>
       </w:r>
       <w:r>
         <w:rPr>
@@ -5622,6 +5942,7 @@
         </w:rPr>
         <w:t>so</w:t>
       </w:r>
+      <w:proofErr w:type="gramEnd"/>
       <w:r>
         <w:rPr>
           <w:sz w:val="28"/>
@@ -5733,7 +6054,7 @@
                     </pic:cNvPicPr>
                   </pic:nvPicPr>
                   <pic:blipFill>
-                    <a:blip r:embed="rId25"/>
+                    <a:blip r:embed="rId26"/>
                     <a:srcRect/>
                     <a:stretch>
                       <a:fillRect/>
@@ -5882,7 +6203,7 @@
                     </pic:cNvPicPr>
                   </pic:nvPicPr>
                   <pic:blipFill>
-                    <a:blip r:embed="rId22"/>
+                    <a:blip r:embed="rId23"/>
                     <a:srcRect/>
                     <a:stretch>
                       <a:fillRect/>
@@ -6223,7 +6544,7 @@
                     </pic:cNvPicPr>
                   </pic:nvPicPr>
                   <pic:blipFill>
-                    <a:blip r:embed="rId21"/>
+                    <a:blip r:embed="rId22"/>
                     <a:srcRect/>
                     <a:stretch>
                       <a:fillRect/>
@@ -6765,7 +7086,7 @@
                     </pic:cNvPicPr>
                   </pic:nvPicPr>
                   <pic:blipFill>
-                    <a:blip r:embed="rId26"/>
+                    <a:blip r:embed="rId27"/>
                     <a:srcRect/>
                     <a:stretch>
                       <a:fillRect/>
@@ -6919,7 +7240,7 @@
                     </pic:cNvPicPr>
                   </pic:nvPicPr>
                   <pic:blipFill>
-                    <a:blip r:embed="rId27"/>
+                    <a:blip r:embed="rId28"/>
                     <a:srcRect/>
                     <a:stretch>
                       <a:fillRect/>
@@ -7178,7 +7499,17 @@
           <w:szCs w:val="28"/>
           <w:u w:val="none"/>
         </w:rPr>
-        <w:t xml:space="preserve"> figure 2</w:t>
+        <w:t xml:space="preserve"> figure </w:t>
+      </w:r>
+      <w:proofErr w:type="gramStart"/>
+      <w:r>
+        <w:rPr>
+          <w:b/>
+          <w:sz w:val="28"/>
+          <w:szCs w:val="28"/>
+          <w:u w:val="none"/>
+        </w:rPr>
+        <w:t>2</w:t>
       </w:r>
       <w:r>
         <w:rPr>
@@ -7195,7 +7526,16 @@
           <w:szCs w:val="28"/>
           <w:u w:val="none"/>
         </w:rPr>
-        <w:t xml:space="preserve">These all Transactions shown as </w:t>
+        <w:t>These</w:t>
+      </w:r>
+      <w:proofErr w:type="gramEnd"/>
+      <w:r>
+        <w:rPr>
+          <w:sz w:val="28"/>
+          <w:szCs w:val="28"/>
+          <w:u w:val="none"/>
+        </w:rPr>
+        <w:t xml:space="preserve"> all Transactions shown as </w:t>
       </w:r>
       <w:r>
         <w:rPr>
@@ -7258,7 +7598,7 @@
                     </pic:cNvPicPr>
                   </pic:nvPicPr>
                   <pic:blipFill>
-                    <a:blip r:embed="rId28"/>
+                    <a:blip r:embed="rId29"/>
                     <a:srcRect/>
                     <a:stretch>
                       <a:fillRect/>
@@ -7442,7 +7782,7 @@
                     </pic:cNvPicPr>
                   </pic:nvPicPr>
                   <pic:blipFill>
-                    <a:blip r:embed="rId29"/>
+                    <a:blip r:embed="rId30"/>
                     <a:srcRect/>
                     <a:stretch>
                       <a:fillRect/>
@@ -7733,7 +8073,7 @@
                     </pic:cNvPicPr>
                   </pic:nvPicPr>
                   <pic:blipFill>
-                    <a:blip r:embed="rId30"/>
+                    <a:blip r:embed="rId31"/>
                     <a:srcRect/>
                     <a:stretch>
                       <a:fillRect/>
@@ -8107,7 +8447,7 @@
                     </pic:cNvPicPr>
                   </pic:nvPicPr>
                   <pic:blipFill>
-                    <a:blip r:embed="rId31"/>
+                    <a:blip r:embed="rId32"/>
                     <a:srcRect/>
                     <a:stretch>
                       <a:fillRect/>
@@ -8620,7 +8960,7 @@
                     </pic:cNvPicPr>
                   </pic:nvPicPr>
                   <pic:blipFill>
-                    <a:blip r:embed="rId32"/>
+                    <a:blip r:embed="rId33"/>
                     <a:srcRect/>
                     <a:stretch>
                       <a:fillRect/>
@@ -8823,7 +9163,7 @@
                     </pic:cNvPicPr>
                   </pic:nvPicPr>
                   <pic:blipFill>
-                    <a:blip r:embed="rId33"/>
+                    <a:blip r:embed="rId34"/>
                     <a:srcRect/>
                     <a:stretch>
                       <a:fillRect/>
@@ -8986,7 +9326,7 @@
                     </pic:cNvPicPr>
                   </pic:nvPicPr>
                   <pic:blipFill>
-                    <a:blip r:embed="rId34"/>
+                    <a:blip r:embed="rId35"/>
                     <a:srcRect/>
                     <a:stretch>
                       <a:fillRect/>
@@ -9141,7 +9481,7 @@
                     </pic:cNvPicPr>
                   </pic:nvPicPr>
                   <pic:blipFill>
-                    <a:blip r:embed="rId35"/>
+                    <a:blip r:embed="rId36"/>
                     <a:srcRect/>
                     <a:stretch>
                       <a:fillRect/>

</xml_diff>

<commit_message>
Updated user manual of Online_inventory_management_system with how to make each bar for login which was in dropdown
</commit_message>
<xml_diff>
--- a/User Manual.docx
+++ b/User Manual.docx
@@ -132,77 +132,13 @@
           <w:u w:val="none"/>
         </w:rPr>
       </w:pPr>
-      <w:proofErr w:type="gramStart"/>
-      <w:r>
-        <w:rPr>
-          <w:sz w:val="28"/>
-          <w:szCs w:val="28"/>
-          <w:u w:val="none"/>
-        </w:rPr>
-        <w:t>SOLUTION:-</w:t>
-      </w:r>
-      <w:proofErr w:type="gramEnd"/>
-      <w:r>
-        <w:rPr>
-          <w:sz w:val="28"/>
-          <w:szCs w:val="28"/>
-          <w:u w:val="none"/>
-        </w:rPr>
-        <w:t xml:space="preserve"> one a project, make a project, make </w:t>
-      </w:r>
-      <w:proofErr w:type="spellStart"/>
-      <w:r>
-        <w:rPr>
-          <w:sz w:val="28"/>
-          <w:szCs w:val="28"/>
-          <w:u w:val="none"/>
-        </w:rPr>
-        <w:t>Jframe</w:t>
-      </w:r>
-      <w:proofErr w:type="spellEnd"/>
-      <w:r>
-        <w:rPr>
-          <w:sz w:val="28"/>
-          <w:szCs w:val="28"/>
-          <w:u w:val="none"/>
-        </w:rPr>
-        <w:t xml:space="preserve">, open SWING menus and then put MENU bar </w:t>
-      </w:r>
-      <w:proofErr w:type="gramStart"/>
-      <w:r>
-        <w:rPr>
-          <w:sz w:val="28"/>
-          <w:szCs w:val="28"/>
-          <w:u w:val="none"/>
-        </w:rPr>
-        <w:t>where</w:t>
-      </w:r>
-      <w:proofErr w:type="gramEnd"/>
-      <w:r>
-        <w:rPr>
-          <w:sz w:val="28"/>
-          <w:szCs w:val="28"/>
-          <w:u w:val="none"/>
-        </w:rPr>
-        <w:t xml:space="preserve"> removed first one and then re-named second </w:t>
-      </w:r>
-      <w:proofErr w:type="gramStart"/>
-      <w:r>
-        <w:rPr>
-          <w:sz w:val="28"/>
-          <w:szCs w:val="28"/>
-          <w:u w:val="none"/>
-        </w:rPr>
-        <w:t>one(</w:t>
-      </w:r>
-      <w:proofErr w:type="gramEnd"/>
-      <w:r>
-        <w:rPr>
-          <w:sz w:val="28"/>
-          <w:szCs w:val="28"/>
-          <w:u w:val="none"/>
-        </w:rPr>
-        <w:t>EDIT) with login</w:t>
+      <w:r>
+        <w:rPr>
+          <w:sz w:val="28"/>
+          <w:szCs w:val="28"/>
+          <w:u w:val="none"/>
+        </w:rPr>
+        <w:t>SOLUTION:- one a project, make a project, make Jframe, open SWING menus and then put MENU bar where removed first one and then re-named second one(EDIT) with login</w:t>
       </w:r>
       <w:r>
         <w:rPr>
@@ -451,45 +387,14 @@
         </w:rPr>
         <w:t xml:space="preserve"> </w:t>
       </w:r>
-      <w:proofErr w:type="spellStart"/>
-      <w:r>
-        <w:rPr>
-          <w:b/>
-          <w:sz w:val="28"/>
-          <w:szCs w:val="28"/>
-          <w:u w:val="none"/>
-        </w:rPr>
-        <w:t>jmenu</w:t>
-      </w:r>
-      <w:proofErr w:type="spellEnd"/>
-      <w:r>
-        <w:rPr>
-          <w:b/>
-          <w:sz w:val="28"/>
-          <w:szCs w:val="28"/>
-          <w:u w:val="none"/>
-        </w:rPr>
-        <w:t xml:space="preserve">, add from </w:t>
-      </w:r>
-      <w:proofErr w:type="spellStart"/>
-      <w:r>
-        <w:rPr>
-          <w:b/>
-          <w:sz w:val="28"/>
-          <w:szCs w:val="28"/>
-          <w:u w:val="none"/>
-        </w:rPr>
-        <w:t>pallete</w:t>
-      </w:r>
-      <w:proofErr w:type="spellEnd"/>
-      <w:r>
-        <w:rPr>
-          <w:b/>
-          <w:sz w:val="28"/>
-          <w:szCs w:val="28"/>
-          <w:u w:val="none"/>
-        </w:rPr>
-        <w:t xml:space="preserve">, menu </w:t>
+      <w:r>
+        <w:rPr>
+          <w:b/>
+          <w:sz w:val="28"/>
+          <w:szCs w:val="28"/>
+          <w:u w:val="none"/>
+        </w:rPr>
+        <w:t xml:space="preserve">jmenu, add from pallete, menu </w:t>
       </w:r>
       <w:r>
         <w:rPr>
@@ -585,7 +490,6 @@
         </w:rPr>
         <w:t xml:space="preserve">n or press </w:t>
       </w:r>
-      <w:proofErr w:type="spellStart"/>
       <w:r>
         <w:rPr>
           <w:b/>
@@ -595,7 +499,6 @@
         </w:rPr>
         <w:t>Ctrl+S</w:t>
       </w:r>
-      <w:proofErr w:type="spellEnd"/>
       <w:r>
         <w:rPr>
           <w:b/>
@@ -661,7 +564,6 @@
         </w:rPr>
         <w:t xml:space="preserve"> </w:t>
       </w:r>
-      <w:proofErr w:type="spellStart"/>
       <w:r>
         <w:rPr>
           <w:b/>
@@ -671,7 +573,6 @@
         </w:rPr>
         <w:t>Ctrl+I</w:t>
       </w:r>
-      <w:proofErr w:type="spellEnd"/>
       <w:r>
         <w:rPr>
           <w:b/>
@@ -755,17 +656,23 @@
         </w:rPr>
         <w:t xml:space="preserve">click on Sales Manager or press </w:t>
       </w:r>
-      <w:proofErr w:type="spellStart"/>
-      <w:r>
-        <w:rPr>
-          <w:b/>
-          <w:sz w:val="28"/>
-          <w:szCs w:val="28"/>
-          <w:u w:val="none"/>
-        </w:rPr>
-        <w:t>Ctrl+M</w:t>
-      </w:r>
-      <w:proofErr w:type="spellEnd"/>
+      <w:r>
+        <w:rPr>
+          <w:b/>
+          <w:sz w:val="28"/>
+          <w:szCs w:val="28"/>
+          <w:u w:val="none"/>
+        </w:rPr>
+        <w:t xml:space="preserve">Ctrl+M </w:t>
+      </w:r>
+      <w:r>
+        <w:rPr>
+          <w:sz w:val="28"/>
+          <w:szCs w:val="28"/>
+          <w:u w:val="none"/>
+        </w:rPr>
+        <w:t>from</w:t>
+      </w:r>
       <w:r>
         <w:rPr>
           <w:b/>
@@ -781,23 +688,6 @@
           <w:szCs w:val="28"/>
           <w:u w:val="none"/>
         </w:rPr>
-        <w:t>from</w:t>
-      </w:r>
-      <w:r>
-        <w:rPr>
-          <w:b/>
-          <w:sz w:val="28"/>
-          <w:szCs w:val="28"/>
-          <w:u w:val="none"/>
-        </w:rPr>
-        <w:t xml:space="preserve"> </w:t>
-      </w:r>
-      <w:r>
-        <w:rPr>
-          <w:sz w:val="28"/>
-          <w:szCs w:val="28"/>
-          <w:u w:val="none"/>
-        </w:rPr>
         <w:t>key</w:t>
       </w:r>
       <w:r>
@@ -840,25 +730,14 @@
         </w:rPr>
         <w:t xml:space="preserve"> click on Administrator or press </w:t>
       </w:r>
-      <w:proofErr w:type="spellStart"/>
-      <w:r>
-        <w:rPr>
-          <w:b/>
-          <w:sz w:val="28"/>
-          <w:szCs w:val="28"/>
-          <w:u w:val="none"/>
-        </w:rPr>
-        <w:t>Ctrl+A</w:t>
-      </w:r>
-      <w:proofErr w:type="spellEnd"/>
-      <w:r>
-        <w:rPr>
-          <w:b/>
-          <w:sz w:val="28"/>
-          <w:szCs w:val="28"/>
-          <w:u w:val="none"/>
-        </w:rPr>
-        <w:t xml:space="preserve"> </w:t>
+      <w:r>
+        <w:rPr>
+          <w:b/>
+          <w:sz w:val="28"/>
+          <w:szCs w:val="28"/>
+          <w:u w:val="none"/>
+        </w:rPr>
+        <w:t xml:space="preserve">Ctrl+A </w:t>
       </w:r>
       <w:r>
         <w:rPr>
@@ -1160,6 +1039,38 @@
     </w:p>
     <w:p>
       <w:pPr>
+        <w:rPr>
+          <w:b/>
+          <w:noProof/>
+          <w:sz w:val="28"/>
+          <w:szCs w:val="28"/>
+          <w:u w:val="none"/>
+        </w:rPr>
+      </w:pPr>
+      <w:r>
+        <w:rPr>
+          <w:b/>
+          <w:noProof/>
+          <w:sz w:val="28"/>
+          <w:szCs w:val="28"/>
+          <w:u w:val="none"/>
+        </w:rPr>
+        <w:lastRenderedPageBreak/>
+        <w:t>For each We have to make a New Jframe and then add panel to whole screen then to properties and then to border to titled border to set the name upon the bar then adding labels, text fields, and buttons for the whole designing</w:t>
+      </w:r>
+      <w:r>
+        <w:rPr>
+          <w:b/>
+          <w:noProof/>
+          <w:sz w:val="28"/>
+          <w:szCs w:val="28"/>
+          <w:u w:val="none"/>
+        </w:rPr>
+        <w:t>.</w:t>
+      </w:r>
+    </w:p>
+    <w:p>
+      <w:pPr>
         <w:jc w:val="center"/>
         <w:rPr>
           <w:b/>
@@ -1177,7 +1088,6 @@
           <w:szCs w:val="28"/>
           <w:u w:val="none"/>
         </w:rPr>
-        <w:lastRenderedPageBreak/>
         <w:drawing>
           <wp:anchor distT="0" distB="0" distL="114300" distR="114300" simplePos="0" relativeHeight="251662336" behindDoc="0" locked="0" layoutInCell="1" allowOverlap="1" wp14:anchorId="76D49720" wp14:editId="54B6AB79">
             <wp:simplePos x="0" y="0"/>
@@ -2622,44 +2532,16 @@
           <w:szCs w:val="28"/>
           <w:u w:val="none"/>
         </w:rPr>
-        <w:t xml:space="preserve"> select that record first and after that click on modify button, after clicking on modify button a new form </w:t>
-      </w:r>
-      <w:proofErr w:type="gramStart"/>
-      <w:r>
-        <w:rPr>
-          <w:sz w:val="28"/>
-          <w:szCs w:val="28"/>
-          <w:u w:val="none"/>
-        </w:rPr>
-        <w:t>open</w:t>
-      </w:r>
-      <w:proofErr w:type="gramEnd"/>
-      <w:r>
-        <w:rPr>
-          <w:sz w:val="28"/>
-          <w:szCs w:val="28"/>
-          <w:u w:val="none"/>
-        </w:rPr>
-        <w:t xml:space="preserve"> as shown in </w:t>
-      </w:r>
-      <w:r>
-        <w:rPr>
-          <w:b/>
-          <w:sz w:val="28"/>
-          <w:szCs w:val="28"/>
-          <w:u w:val="none"/>
-        </w:rPr>
-        <w:t xml:space="preserve">figure </w:t>
-      </w:r>
-      <w:proofErr w:type="gramStart"/>
-      <w:r>
-        <w:rPr>
-          <w:b/>
-          <w:sz w:val="28"/>
-          <w:szCs w:val="28"/>
-          <w:u w:val="none"/>
-        </w:rPr>
-        <w:t>11</w:t>
+        <w:t xml:space="preserve"> select that record first and after that click on modify button, after clicking on modify button a new form open as shown in </w:t>
+      </w:r>
+      <w:r>
+        <w:rPr>
+          <w:b/>
+          <w:sz w:val="28"/>
+          <w:szCs w:val="28"/>
+          <w:u w:val="none"/>
+        </w:rPr>
+        <w:t>figure 11</w:t>
       </w:r>
       <w:r>
         <w:rPr>
@@ -2675,16 +2557,7 @@
           <w:szCs w:val="28"/>
           <w:u w:val="none"/>
         </w:rPr>
-        <w:t>In</w:t>
-      </w:r>
-      <w:proofErr w:type="gramEnd"/>
-      <w:r>
-        <w:rPr>
-          <w:sz w:val="28"/>
-          <w:szCs w:val="28"/>
-          <w:u w:val="none"/>
-        </w:rPr>
-        <w:t xml:space="preserve"> this </w:t>
+        <w:t xml:space="preserve">In this </w:t>
       </w:r>
       <w:r>
         <w:rPr>
@@ -2970,25 +2843,7 @@
           <w:szCs w:val="28"/>
           <w:u w:val="none"/>
         </w:rPr>
-        <w:t xml:space="preserve">it </w:t>
-      </w:r>
-      <w:proofErr w:type="gramStart"/>
-      <w:r>
-        <w:rPr>
-          <w:sz w:val="28"/>
-          <w:szCs w:val="28"/>
-          <w:u w:val="none"/>
-        </w:rPr>
-        <w:t>show</w:t>
-      </w:r>
-      <w:proofErr w:type="gramEnd"/>
-      <w:r>
-        <w:rPr>
-          <w:sz w:val="28"/>
-          <w:szCs w:val="28"/>
-          <w:u w:val="none"/>
-        </w:rPr>
-        <w:t xml:space="preserve"> the Status of Inventory. </w:t>
+        <w:t xml:space="preserve">it show the Status of Inventory. </w:t>
       </w:r>
       <w:r>
         <w:rPr>
@@ -3247,25 +3102,7 @@
           <w:szCs w:val="28"/>
           <w:u w:val="none"/>
         </w:rPr>
-        <w:t xml:space="preserve"> a new form </w:t>
-      </w:r>
-      <w:proofErr w:type="gramStart"/>
-      <w:r>
-        <w:rPr>
-          <w:sz w:val="28"/>
-          <w:szCs w:val="28"/>
-          <w:u w:val="none"/>
-        </w:rPr>
-        <w:t>open</w:t>
-      </w:r>
-      <w:proofErr w:type="gramEnd"/>
-      <w:r>
-        <w:rPr>
-          <w:sz w:val="28"/>
-          <w:szCs w:val="28"/>
-          <w:u w:val="none"/>
-        </w:rPr>
-        <w:t xml:space="preserve"> as shown in </w:t>
+        <w:t xml:space="preserve"> a new form open as shown in </w:t>
       </w:r>
       <w:r>
         <w:rPr>
@@ -3314,44 +3151,26 @@
           <w:szCs w:val="28"/>
           <w:u w:val="none"/>
         </w:rPr>
+        <w:t xml:space="preserve"> click on </w:t>
+      </w:r>
+      <w:r>
+        <w:rPr>
+          <w:b/>
+          <w:sz w:val="28"/>
+          <w:szCs w:val="28"/>
+          <w:u w:val="none"/>
+        </w:rPr>
+        <w:t>Add Button</w:t>
+      </w:r>
+      <w:r>
+        <w:rPr>
+          <w:b/>
+          <w:sz w:val="28"/>
+          <w:szCs w:val="28"/>
+          <w:u w:val="none"/>
+        </w:rPr>
         <w:t xml:space="preserve"> </w:t>
       </w:r>
-      <w:proofErr w:type="gramStart"/>
-      <w:r>
-        <w:rPr>
-          <w:sz w:val="28"/>
-          <w:szCs w:val="28"/>
-          <w:u w:val="none"/>
-        </w:rPr>
-        <w:t>click</w:t>
-      </w:r>
-      <w:proofErr w:type="gramEnd"/>
-      <w:r>
-        <w:rPr>
-          <w:sz w:val="28"/>
-          <w:szCs w:val="28"/>
-          <w:u w:val="none"/>
-        </w:rPr>
-        <w:t xml:space="preserve"> on </w:t>
-      </w:r>
-      <w:r>
-        <w:rPr>
-          <w:b/>
-          <w:sz w:val="28"/>
-          <w:szCs w:val="28"/>
-          <w:u w:val="none"/>
-        </w:rPr>
-        <w:t>Add Button</w:t>
-      </w:r>
-      <w:r>
-        <w:rPr>
-          <w:b/>
-          <w:sz w:val="28"/>
-          <w:szCs w:val="28"/>
-          <w:u w:val="none"/>
-        </w:rPr>
-        <w:t xml:space="preserve"> </w:t>
-      </w:r>
       <w:r>
         <w:rPr>
           <w:sz w:val="28"/>
@@ -3366,25 +3185,7 @@
           <w:szCs w:val="28"/>
           <w:u w:val="none"/>
         </w:rPr>
-        <w:t xml:space="preserve"> record add on </w:t>
-      </w:r>
-      <w:proofErr w:type="gramStart"/>
-      <w:r>
-        <w:rPr>
-          <w:sz w:val="28"/>
-          <w:szCs w:val="28"/>
-          <w:u w:val="none"/>
-        </w:rPr>
-        <w:t>form  Table</w:t>
-      </w:r>
-      <w:proofErr w:type="gramEnd"/>
-      <w:r>
-        <w:rPr>
-          <w:sz w:val="28"/>
-          <w:szCs w:val="28"/>
-          <w:u w:val="none"/>
-        </w:rPr>
-        <w:t xml:space="preserve"> and al</w:t>
+        <w:t xml:space="preserve"> record add on form  Table and al</w:t>
       </w:r>
       <w:r>
         <w:rPr>
@@ -3457,25 +3258,7 @@
           <w:szCs w:val="28"/>
           <w:u w:val="none"/>
         </w:rPr>
-        <w:t xml:space="preserve"> </w:t>
-      </w:r>
-      <w:proofErr w:type="gramStart"/>
-      <w:r>
-        <w:rPr>
-          <w:sz w:val="28"/>
-          <w:szCs w:val="28"/>
-          <w:u w:val="none"/>
-        </w:rPr>
-        <w:t>click</w:t>
-      </w:r>
-      <w:proofErr w:type="gramEnd"/>
-      <w:r>
-        <w:rPr>
-          <w:sz w:val="28"/>
-          <w:szCs w:val="28"/>
-          <w:u w:val="none"/>
-        </w:rPr>
-        <w:t xml:space="preserve"> on </w:t>
+        <w:t xml:space="preserve"> click on </w:t>
       </w:r>
       <w:r>
         <w:rPr>
@@ -5907,17 +5690,7 @@
           <w:szCs w:val="28"/>
           <w:u w:val="none"/>
         </w:rPr>
-        <w:t xml:space="preserve">s </w:t>
-      </w:r>
-      <w:proofErr w:type="gramStart"/>
-      <w:r>
-        <w:rPr>
-          <w:b/>
-          <w:sz w:val="28"/>
-          <w:szCs w:val="28"/>
-          <w:u w:val="none"/>
-        </w:rPr>
-        <w:t>Button</w:t>
+        <w:t>s Button</w:t>
       </w:r>
       <w:r>
         <w:rPr>
@@ -5942,7 +5715,6 @@
         </w:rPr>
         <w:t>so</w:t>
       </w:r>
-      <w:proofErr w:type="gramEnd"/>
       <w:r>
         <w:rPr>
           <w:sz w:val="28"/>
@@ -7499,17 +7271,7 @@
           <w:szCs w:val="28"/>
           <w:u w:val="none"/>
         </w:rPr>
-        <w:t xml:space="preserve"> figure </w:t>
-      </w:r>
-      <w:proofErr w:type="gramStart"/>
-      <w:r>
-        <w:rPr>
-          <w:b/>
-          <w:sz w:val="28"/>
-          <w:szCs w:val="28"/>
-          <w:u w:val="none"/>
-        </w:rPr>
-        <w:t>2</w:t>
+        <w:t xml:space="preserve"> figure 2</w:t>
       </w:r>
       <w:r>
         <w:rPr>
@@ -7526,16 +7288,7 @@
           <w:szCs w:val="28"/>
           <w:u w:val="none"/>
         </w:rPr>
-        <w:t>These</w:t>
-      </w:r>
-      <w:proofErr w:type="gramEnd"/>
-      <w:r>
-        <w:rPr>
-          <w:sz w:val="28"/>
-          <w:szCs w:val="28"/>
-          <w:u w:val="none"/>
-        </w:rPr>
-        <w:t xml:space="preserve"> all Transactions shown as </w:t>
+        <w:t xml:space="preserve">These all Transactions shown as </w:t>
       </w:r>
       <w:r>
         <w:rPr>

</xml_diff>